<commit_message>
Separate Workshop Overview from Chapter 1
- Workshop Overview is now a standalone document (PDF + Word):
  · Workshop_Overview_2026.pdf (existing terracotta-styled PDF)
  · Workshop_Overview_2026.docx (new — background, objectives, resource
    persons with speaker cards, full 2-day programme, partner institutions,
    participants table, expected outcomes)

- Chapter 1 now covers ONLY the Mortality Analysis:
  · Removed: Workshop Background, Resource Persons, Programme sections
  · New title: "Elephant Mortality Analysis in Chhattisgarh (2021-2026)"
  · Sections renumbered 1-9 (Population → Casualties → CoD → Demographics
    → Seasonal → Range-wise → Drowning PM → Case Study → Recommendations)
  · Regenerated Workshop_Chapter1_2026.pdf (29 KB) and .docx (42 KB)

- Added generate_overview_docx.py for the standalone Overview Word doc

https://claude.ai/code/session_016WQM6ThbEcq21sYa9B7dUx
</commit_message>
<xml_diff>
--- a/Workshop_Chapter1_2026.docx
+++ b/Workshop_Chapter1_2026.docx
@@ -38,7 +38,7 @@
                 <w:color w:val="FFFFFF"/>
                 <w:sz w:val="32"/>
               </w:rPr>
-              <w:t>Workshop Overview &amp; Elephant Mortality Analysis</w:t>
+              <w:t>Elephant Mortality Analysis in Chhattisgarh (2021–2026)</w:t>
             </w:r>
             <w:r>
               <w:br/>
@@ -49,7 +49,7 @@
                 <w:color w:val="D8F3DC"/>
                 <w:sz w:val="19"/>
               </w:rPr>
-              <w:t>Chhattisgarh 2021–2026: Trends, Causes &amp; Recommendations</w:t>
+              <w:t>Trends, Causes, Demographics &amp; Priority Recommendations</w:t>
             </w:r>
             <w:r>
               <w:br/>
@@ -92,740 +92,7 @@
                 <w:b/>
                 <w:color w:val="FFFFFF"/>
               </w:rPr>
-              <w:t>1. Workshop Background &amp; Objectives</w:t>
-            </w:r>
-          </w:p>
-        </w:tc>
-      </w:tr>
-    </w:tbl>
-    <w:p/>
-    <w:p>
-      <w:pPr>
-        <w:pStyle w:val="WS_Body"/>
-      </w:pPr>
-      <w:r>
-        <w:t>The Workshop on Essentials for Mortality Investigation of Asian Elephant was organised by the Chhattisgarh Forest Department with technical support from the Wildlife Institute of India (WII), Dehradun, and laboratory partners ICAR-IVRI, Bareilly and NDVSU, Jabalpur. The two-day programme (5–6 June 2026, Raigarh) brought together 84 field officers and wildlife veterinarians to build capacity in systematic elephant necropsy, sample collection, disease diagnosis, and evidence-based mortality investigations.</w:t>
-      </w:r>
-    </w:p>
-    <w:tbl>
-      <w:tblPr>
-        <w:tblStyle w:val="TableGrid"/>
-        <w:tblW w:type="auto" w:w="0"/>
-        <w:tblLook w:firstColumn="1" w:firstRow="1" w:lastColumn="0" w:lastRow="0" w:noHBand="0" w:noVBand="1" w:val="04A0"/>
-      </w:tblPr>
-      <w:tblGrid>
-        <w:gridCol w:w="4819"/>
-        <w:gridCol w:w="4819"/>
-      </w:tblGrid>
-      <w:tr>
-        <w:tc>
-          <w:tcPr>
-            <w:tcW w:type="dxa" w:w="3402"/>
-            <w:shd w:val="clear" w:color="auto" w:fill="2D6A4F"/>
-          </w:tcPr>
-          <w:p>
-            <w:pPr>
-              <w:pStyle w:val="WS_TH"/>
-              <w:spacing w:before="60" w:after="60"/>
-            </w:pPr>
-            <w:r>
-              <w:rPr>
-                <w:b/>
-                <w:color w:val="FFFFFF"/>
-              </w:rPr>
-              <w:t>Statistic</w:t>
-            </w:r>
-          </w:p>
-        </w:tc>
-        <w:tc>
-          <w:tcPr>
-            <w:tcW w:type="dxa" w:w="5669"/>
-            <w:shd w:val="clear" w:color="auto" w:fill="2D6A4F"/>
-          </w:tcPr>
-          <w:p>
-            <w:pPr>
-              <w:pStyle w:val="WS_TH"/>
-              <w:spacing w:before="60" w:after="60"/>
-            </w:pPr>
-            <w:r>
-              <w:rPr>
-                <w:b/>
-                <w:color w:val="FFFFFF"/>
-              </w:rPr>
-              <w:t>Value</w:t>
-            </w:r>
-          </w:p>
-        </w:tc>
-      </w:tr>
-      <w:tr>
-        <w:tc>
-          <w:tcPr>
-            <w:tcW w:type="dxa" w:w="3402"/>
-            <w:shd w:val="clear" w:color="auto" w:fill="FFFFFF"/>
-          </w:tcPr>
-          <w:p>
-            <w:pPr>
-              <w:pStyle w:val="WS_TD"/>
-              <w:spacing w:before="40" w:after="40"/>
-            </w:pPr>
-            <w:r>
-              <w:t>Participants</w:t>
-            </w:r>
-          </w:p>
-        </w:tc>
-        <w:tc>
-          <w:tcPr>
-            <w:tcW w:type="dxa" w:w="5669"/>
-            <w:shd w:val="clear" w:color="auto" w:fill="FFFFFF"/>
-          </w:tcPr>
-          <w:p>
-            <w:pPr>
-              <w:pStyle w:val="WS_TD"/>
-              <w:spacing w:before="40" w:after="40"/>
-            </w:pPr>
-            <w:r>
-              <w:t>84</w:t>
-            </w:r>
-          </w:p>
-        </w:tc>
-      </w:tr>
-      <w:tr>
-        <w:tc>
-          <w:tcPr>
-            <w:tcW w:type="dxa" w:w="3402"/>
-            <w:shd w:val="clear" w:color="auto" w:fill="EAF7EE"/>
-          </w:tcPr>
-          <w:p>
-            <w:pPr>
-              <w:pStyle w:val="WS_TD"/>
-              <w:spacing w:before="40" w:after="40"/>
-            </w:pPr>
-            <w:r>
-              <w:t>Duration</w:t>
-            </w:r>
-          </w:p>
-        </w:tc>
-        <w:tc>
-          <w:tcPr>
-            <w:tcW w:type="dxa" w:w="5669"/>
-            <w:shd w:val="clear" w:color="auto" w:fill="EAF7EE"/>
-          </w:tcPr>
-          <w:p>
-            <w:pPr>
-              <w:pStyle w:val="WS_TD"/>
-              <w:spacing w:before="40" w:after="40"/>
-            </w:pPr>
-            <w:r>
-              <w:t>2 days (5–6 June 2026)</w:t>
-            </w:r>
-          </w:p>
-        </w:tc>
-      </w:tr>
-      <w:tr>
-        <w:tc>
-          <w:tcPr>
-            <w:tcW w:type="dxa" w:w="3402"/>
-            <w:shd w:val="clear" w:color="auto" w:fill="FFFFFF"/>
-          </w:tcPr>
-          <w:p>
-            <w:pPr>
-              <w:pStyle w:val="WS_TD"/>
-              <w:spacing w:before="40" w:after="40"/>
-            </w:pPr>
-            <w:r>
-              <w:t>Venue</w:t>
-            </w:r>
-          </w:p>
-        </w:tc>
-        <w:tc>
-          <w:tcPr>
-            <w:tcW w:type="dxa" w:w="5669"/>
-            <w:shd w:val="clear" w:color="auto" w:fill="FFFFFF"/>
-          </w:tcPr>
-          <w:p>
-            <w:pPr>
-              <w:pStyle w:val="WS_TD"/>
-              <w:spacing w:before="40" w:after="40"/>
-            </w:pPr>
-            <w:r>
-              <w:t>Raigarh, Chhattisgarh</w:t>
-            </w:r>
-          </w:p>
-        </w:tc>
-      </w:tr>
-      <w:tr>
-        <w:tc>
-          <w:tcPr>
-            <w:tcW w:type="dxa" w:w="3402"/>
-            <w:shd w:val="clear" w:color="auto" w:fill="EAF7EE"/>
-          </w:tcPr>
-          <w:p>
-            <w:pPr>
-              <w:pStyle w:val="WS_TD"/>
-              <w:spacing w:before="40" w:after="40"/>
-            </w:pPr>
-            <w:r>
-              <w:t>Resource Persons</w:t>
-            </w:r>
-          </w:p>
-        </w:tc>
-        <w:tc>
-          <w:tcPr>
-            <w:tcW w:type="dxa" w:w="5669"/>
-            <w:shd w:val="clear" w:color="auto" w:fill="EAF7EE"/>
-          </w:tcPr>
-          <w:p>
-            <w:pPr>
-              <w:pStyle w:val="WS_TD"/>
-              <w:spacing w:before="40" w:after="40"/>
-            </w:pPr>
-            <w:r>
-              <w:t>5 expert faculty</w:t>
-            </w:r>
-          </w:p>
-        </w:tc>
-      </w:tr>
-      <w:tr>
-        <w:tc>
-          <w:tcPr>
-            <w:tcW w:type="dxa" w:w="3402"/>
-            <w:shd w:val="clear" w:color="auto" w:fill="FFFFFF"/>
-          </w:tcPr>
-          <w:p>
-            <w:pPr>
-              <w:pStyle w:val="WS_TD"/>
-              <w:spacing w:before="40" w:after="40"/>
-            </w:pPr>
-            <w:r>
-              <w:t>Partner Institutions</w:t>
-            </w:r>
-          </w:p>
-        </w:tc>
-        <w:tc>
-          <w:tcPr>
-            <w:tcW w:type="dxa" w:w="5669"/>
-            <w:shd w:val="clear" w:color="auto" w:fill="FFFFFF"/>
-          </w:tcPr>
-          <w:p>
-            <w:pPr>
-              <w:pStyle w:val="WS_TD"/>
-              <w:spacing w:before="40" w:after="40"/>
-            </w:pPr>
-            <w:r>
-              <w:t>3 (CG Forest Dept, WII, ICAR-IVRI/NDVSU)</w:t>
-            </w:r>
-          </w:p>
-        </w:tc>
-      </w:tr>
-    </w:tbl>
-    <w:p/>
-    <w:p>
-      <w:pPr>
-        <w:pStyle w:val="WS_H2"/>
-        <w:ind w:left="170"/>
-      </w:pPr>
-      <w:r>
-        <w:rPr>
-          <w:b/>
-          <w:color w:val="2D6A4F"/>
-        </w:rPr>
-        <w:t>Workshop Objectives</w:t>
-      </w:r>
-    </w:p>
-    <w:tbl>
-      <w:tblPr>
-        <w:tblStyle w:val="TableGrid"/>
-        <w:tblW w:type="auto" w:w="0"/>
-        <w:tblLook w:firstColumn="1" w:firstRow="1" w:lastColumn="0" w:lastRow="0" w:noHBand="0" w:noVBand="1" w:val="04A0"/>
-      </w:tblPr>
-      <w:tblGrid>
-        <w:gridCol w:w="4819"/>
-        <w:gridCol w:w="4819"/>
-      </w:tblGrid>
-      <w:tr>
-        <w:tc>
-          <w:tcPr>
-            <w:tcW w:type="dxa" w:w="2835"/>
-            <w:shd w:val="clear" w:color="auto" w:fill="2D6A4F"/>
-          </w:tcPr>
-          <w:p>
-            <w:pPr>
-              <w:pStyle w:val="WS_TH"/>
-              <w:spacing w:before="60" w:after="60"/>
-            </w:pPr>
-            <w:r>
-              <w:rPr>
-                <w:b/>
-                <w:color w:val="FFFFFF"/>
-              </w:rPr>
-              <w:t>Theme</w:t>
-            </w:r>
-          </w:p>
-        </w:tc>
-        <w:tc>
-          <w:tcPr>
-            <w:tcW w:type="dxa" w:w="6803"/>
-            <w:shd w:val="clear" w:color="auto" w:fill="2D6A4F"/>
-          </w:tcPr>
-          <w:p>
-            <w:pPr>
-              <w:pStyle w:val="WS_TH"/>
-              <w:spacing w:before="60" w:after="60"/>
-            </w:pPr>
-            <w:r>
-              <w:rPr>
-                <w:b/>
-                <w:color w:val="FFFFFF"/>
-              </w:rPr>
-              <w:t>Topics Covered</w:t>
-            </w:r>
-          </w:p>
-        </w:tc>
-      </w:tr>
-      <w:tr>
-        <w:tc>
-          <w:tcPr>
-            <w:tcW w:type="dxa" w:w="2835"/>
-            <w:shd w:val="clear" w:color="auto" w:fill="FFFFFF"/>
-          </w:tcPr>
-          <w:p>
-            <w:pPr>
-              <w:pStyle w:val="WS_TD"/>
-              <w:spacing w:before="40" w:after="40"/>
-            </w:pPr>
-            <w:r>
-              <w:t>Biology &amp; Ecology</w:t>
-            </w:r>
-          </w:p>
-        </w:tc>
-        <w:tc>
-          <w:tcPr>
-            <w:tcW w:type="dxa" w:w="6803"/>
-            <w:shd w:val="clear" w:color="auto" w:fill="FFFFFF"/>
-          </w:tcPr>
-          <w:p>
-            <w:pPr>
-              <w:pStyle w:val="WS_TD"/>
-              <w:spacing w:before="40" w:after="40"/>
-            </w:pPr>
-            <w:r>
-              <w:t>Biology, behaviour, ecology of Asian elephants; population dynamics in CG</w:t>
-            </w:r>
-          </w:p>
-        </w:tc>
-      </w:tr>
-      <w:tr>
-        <w:tc>
-          <w:tcPr>
-            <w:tcW w:type="dxa" w:w="2835"/>
-            <w:shd w:val="clear" w:color="auto" w:fill="EAF7EE"/>
-          </w:tcPr>
-          <w:p>
-            <w:pPr>
-              <w:pStyle w:val="WS_TD"/>
-              <w:spacing w:before="40" w:after="40"/>
-            </w:pPr>
-            <w:r>
-              <w:t>Pathology &amp; Disease</w:t>
-            </w:r>
-          </w:p>
-        </w:tc>
-        <w:tc>
-          <w:tcPr>
-            <w:tcW w:type="dxa" w:w="6803"/>
-            <w:shd w:val="clear" w:color="auto" w:fill="EAF7EE"/>
-          </w:tcPr>
-          <w:p>
-            <w:pPr>
-              <w:pStyle w:val="WS_TD"/>
-              <w:spacing w:before="40" w:after="40"/>
-            </w:pPr>
-            <w:r>
-              <w:t>Necropsy procedures, biosafety, sample collection, infectious &amp; non-infectious diseases</w:t>
-            </w:r>
-          </w:p>
-        </w:tc>
-      </w:tr>
-      <w:tr>
-        <w:tc>
-          <w:tcPr>
-            <w:tcW w:type="dxa" w:w="2835"/>
-            <w:shd w:val="clear" w:color="auto" w:fill="FFFFFF"/>
-          </w:tcPr>
-          <w:p>
-            <w:pPr>
-              <w:pStyle w:val="WS_TD"/>
-              <w:spacing w:before="40" w:after="40"/>
-            </w:pPr>
-            <w:r>
-              <w:t>Surveillance &amp; Response</w:t>
-            </w:r>
-          </w:p>
-        </w:tc>
-        <w:tc>
-          <w:tcPr>
-            <w:tcW w:type="dxa" w:w="6803"/>
-            <w:shd w:val="clear" w:color="auto" w:fill="FFFFFF"/>
-          </w:tcPr>
-          <w:p>
-            <w:pPr>
-              <w:pStyle w:val="WS_TD"/>
-              <w:spacing w:before="40" w:after="40"/>
-            </w:pPr>
-            <w:r>
-              <w:t>Elephant surveillance systems, disposal protocols, site remediation, evidence documentation</w:t>
-            </w:r>
-          </w:p>
-        </w:tc>
-      </w:tr>
-    </w:tbl>
-    <w:p/>
-    <w:p>
-      <w:pPr>
-        <w:pStyle w:val="WS_H2"/>
-        <w:ind w:left="170"/>
-      </w:pPr>
-      <w:r>
-        <w:rPr>
-          <w:b/>
-          <w:color w:val="2D6A4F"/>
-        </w:rPr>
-        <w:t>Resource Persons</w:t>
-      </w:r>
-    </w:p>
-    <w:tbl>
-      <w:tblPr>
-        <w:tblStyle w:val="TableGrid"/>
-        <w:tblW w:type="auto" w:w="0"/>
-        <w:tblLook w:firstColumn="1" w:firstRow="1" w:lastColumn="0" w:lastRow="0" w:noHBand="0" w:noVBand="1" w:val="04A0"/>
-      </w:tblPr>
-      <w:tblGrid>
-        <w:gridCol w:w="3213"/>
-        <w:gridCol w:w="3213"/>
-        <w:gridCol w:w="3213"/>
-      </w:tblGrid>
-      <w:tr>
-        <w:tc>
-          <w:tcPr>
-            <w:tcW w:type="dxa" w:w="2835"/>
-            <w:shd w:val="clear" w:color="auto" w:fill="2D6A4F"/>
-          </w:tcPr>
-          <w:p>
-            <w:pPr>
-              <w:pStyle w:val="WS_TH"/>
-              <w:spacing w:before="60" w:after="60"/>
-            </w:pPr>
-            <w:r>
-              <w:rPr>
-                <w:b/>
-                <w:color w:val="FFFFFF"/>
-              </w:rPr>
-              <w:t>Name</w:t>
-            </w:r>
-          </w:p>
-        </w:tc>
-        <w:tc>
-          <w:tcPr>
-            <w:tcW w:type="dxa" w:w="2835"/>
-            <w:shd w:val="clear" w:color="auto" w:fill="2D6A4F"/>
-          </w:tcPr>
-          <w:p>
-            <w:pPr>
-              <w:pStyle w:val="WS_TH"/>
-              <w:spacing w:before="60" w:after="60"/>
-            </w:pPr>
-            <w:r>
-              <w:rPr>
-                <w:b/>
-                <w:color w:val="FFFFFF"/>
-              </w:rPr>
-              <w:t>Institution</w:t>
-            </w:r>
-          </w:p>
-        </w:tc>
-        <w:tc>
-          <w:tcPr>
-            <w:tcW w:type="dxa" w:w="3969"/>
-            <w:shd w:val="clear" w:color="auto" w:fill="2D6A4F"/>
-          </w:tcPr>
-          <w:p>
-            <w:pPr>
-              <w:pStyle w:val="WS_TH"/>
-              <w:spacing w:before="60" w:after="60"/>
-            </w:pPr>
-            <w:r>
-              <w:rPr>
-                <w:b/>
-                <w:color w:val="FFFFFF"/>
-              </w:rPr>
-              <w:t>Expertise</w:t>
-            </w:r>
-          </w:p>
-        </w:tc>
-      </w:tr>
-      <w:tr>
-        <w:tc>
-          <w:tcPr>
-            <w:tcW w:type="dxa" w:w="2835"/>
-            <w:shd w:val="clear" w:color="auto" w:fill="FFFFFF"/>
-          </w:tcPr>
-          <w:p>
-            <w:pPr>
-              <w:pStyle w:val="WS_TD"/>
-              <w:spacing w:before="40" w:after="40"/>
-            </w:pPr>
-            <w:r>
-              <w:t>Dr. A. B. Shrivastav</w:t>
-            </w:r>
-          </w:p>
-        </w:tc>
-        <w:tc>
-          <w:tcPr>
-            <w:tcW w:type="dxa" w:w="2835"/>
-            <w:shd w:val="clear" w:color="auto" w:fill="FFFFFF"/>
-          </w:tcPr>
-          <w:p>
-            <w:pPr>
-              <w:pStyle w:val="WS_TD"/>
-              <w:spacing w:before="40" w:after="40"/>
-            </w:pPr>
-            <w:r>
-              <w:t>NDVSU, Jabalpur</w:t>
-            </w:r>
-          </w:p>
-        </w:tc>
-        <w:tc>
-          <w:tcPr>
-            <w:tcW w:type="dxa" w:w="3969"/>
-            <w:shd w:val="clear" w:color="auto" w:fill="FFFFFF"/>
-          </w:tcPr>
-          <w:p>
-            <w:pPr>
-              <w:pStyle w:val="WS_TD"/>
-              <w:spacing w:before="40" w:after="40"/>
-            </w:pPr>
-            <w:r>
-              <w:t>Wildlife Pathology, Elephant PM Examination</w:t>
-            </w:r>
-          </w:p>
-        </w:tc>
-      </w:tr>
-      <w:tr>
-        <w:tc>
-          <w:tcPr>
-            <w:tcW w:type="dxa" w:w="2835"/>
-            <w:shd w:val="clear" w:color="auto" w:fill="EAF7EE"/>
-          </w:tcPr>
-          <w:p>
-            <w:pPr>
-              <w:pStyle w:val="WS_TD"/>
-              <w:spacing w:before="40" w:after="40"/>
-            </w:pPr>
-            <w:r>
-              <w:t>Dr. Parag Nigam</w:t>
-            </w:r>
-          </w:p>
-        </w:tc>
-        <w:tc>
-          <w:tcPr>
-            <w:tcW w:type="dxa" w:w="2835"/>
-            <w:shd w:val="clear" w:color="auto" w:fill="EAF7EE"/>
-          </w:tcPr>
-          <w:p>
-            <w:pPr>
-              <w:pStyle w:val="WS_TD"/>
-              <w:spacing w:before="40" w:after="40"/>
-            </w:pPr>
-            <w:r>
-              <w:t>WII, Dehradun</w:t>
-            </w:r>
-          </w:p>
-        </w:tc>
-        <w:tc>
-          <w:tcPr>
-            <w:tcW w:type="dxa" w:w="3969"/>
-            <w:shd w:val="clear" w:color="auto" w:fill="EAF7EE"/>
-          </w:tcPr>
-          <w:p>
-            <w:pPr>
-              <w:pStyle w:val="WS_TD"/>
-              <w:spacing w:before="40" w:after="40"/>
-            </w:pPr>
-            <w:r>
-              <w:t>Elephant Ecology &amp; Population Biology</w:t>
-            </w:r>
-          </w:p>
-        </w:tc>
-      </w:tr>
-      <w:tr>
-        <w:tc>
-          <w:tcPr>
-            <w:tcW w:type="dxa" w:w="2835"/>
-            <w:shd w:val="clear" w:color="auto" w:fill="FFFFFF"/>
-          </w:tcPr>
-          <w:p>
-            <w:pPr>
-              <w:pStyle w:val="WS_TD"/>
-              <w:spacing w:before="40" w:after="40"/>
-            </w:pPr>
-            <w:r>
-              <w:t>Dr. Karikalan Mathesh</w:t>
-            </w:r>
-          </w:p>
-        </w:tc>
-        <w:tc>
-          <w:tcPr>
-            <w:tcW w:type="dxa" w:w="2835"/>
-            <w:shd w:val="clear" w:color="auto" w:fill="FFFFFF"/>
-          </w:tcPr>
-          <w:p>
-            <w:pPr>
-              <w:pStyle w:val="WS_TD"/>
-              <w:spacing w:before="40" w:after="40"/>
-            </w:pPr>
-            <w:r>
-              <w:t>ICAR-IVRI, Bareilly</w:t>
-            </w:r>
-          </w:p>
-        </w:tc>
-        <w:tc>
-          <w:tcPr>
-            <w:tcW w:type="dxa" w:w="3969"/>
-            <w:shd w:val="clear" w:color="auto" w:fill="FFFFFF"/>
-          </w:tcPr>
-          <w:p>
-            <w:pPr>
-              <w:pStyle w:val="WS_TD"/>
-              <w:spacing w:before="40" w:after="40"/>
-            </w:pPr>
-            <w:r>
-              <w:t>Veterinary Pathology, Sample Diagnostics</w:t>
-            </w:r>
-          </w:p>
-        </w:tc>
-      </w:tr>
-      <w:tr>
-        <w:tc>
-          <w:tcPr>
-            <w:tcW w:type="dxa" w:w="2835"/>
-            <w:shd w:val="clear" w:color="auto" w:fill="EAF7EE"/>
-          </w:tcPr>
-          <w:p>
-            <w:pPr>
-              <w:pStyle w:val="WS_TD"/>
-              <w:spacing w:before="40" w:after="40"/>
-            </w:pPr>
-            <w:r>
-              <w:t>Dr. Tapendra Saini</w:t>
-            </w:r>
-          </w:p>
-        </w:tc>
-        <w:tc>
-          <w:tcPr>
-            <w:tcW w:type="dxa" w:w="2835"/>
-            <w:shd w:val="clear" w:color="auto" w:fill="EAF7EE"/>
-          </w:tcPr>
-          <w:p>
-            <w:pPr>
-              <w:pStyle w:val="WS_TD"/>
-              <w:spacing w:before="40" w:after="40"/>
-            </w:pPr>
-            <w:r>
-              <w:t>WII, Dehradun</w:t>
-            </w:r>
-          </w:p>
-        </w:tc>
-        <w:tc>
-          <w:tcPr>
-            <w:tcW w:type="dxa" w:w="3969"/>
-            <w:shd w:val="clear" w:color="auto" w:fill="EAF7EE"/>
-          </w:tcPr>
-          <w:p>
-            <w:pPr>
-              <w:pStyle w:val="WS_TD"/>
-              <w:spacing w:before="40" w:after="40"/>
-            </w:pPr>
-            <w:r>
-              <w:t>Wildlife Surveillance &amp; Disease Monitoring</w:t>
-            </w:r>
-          </w:p>
-        </w:tc>
-      </w:tr>
-      <w:tr>
-        <w:tc>
-          <w:tcPr>
-            <w:tcW w:type="dxa" w:w="2835"/>
-            <w:shd w:val="clear" w:color="auto" w:fill="FFFFFF"/>
-          </w:tcPr>
-          <w:p>
-            <w:pPr>
-              <w:pStyle w:val="WS_TD"/>
-              <w:spacing w:before="40" w:after="40"/>
-            </w:pPr>
-            <w:r>
-              <w:t>Dr. Chandra Prakash Sharma</w:t>
-            </w:r>
-          </w:p>
-        </w:tc>
-        <w:tc>
-          <w:tcPr>
-            <w:tcW w:type="dxa" w:w="2835"/>
-            <w:shd w:val="clear" w:color="auto" w:fill="FFFFFF"/>
-          </w:tcPr>
-          <w:p>
-            <w:pPr>
-              <w:pStyle w:val="WS_TD"/>
-              <w:spacing w:before="40" w:after="40"/>
-            </w:pPr>
-            <w:r>
-              <w:t>WII, Dehradun</w:t>
-            </w:r>
-          </w:p>
-        </w:tc>
-        <w:tc>
-          <w:tcPr>
-            <w:tcW w:type="dxa" w:w="3969"/>
-            <w:shd w:val="clear" w:color="auto" w:fill="FFFFFF"/>
-          </w:tcPr>
-          <w:p>
-            <w:pPr>
-              <w:pStyle w:val="WS_TD"/>
-              <w:spacing w:before="40" w:after="40"/>
-            </w:pPr>
-            <w:r>
-              <w:t>Conservation Biology &amp; Field Investigation</w:t>
-            </w:r>
-          </w:p>
-        </w:tc>
-      </w:tr>
-    </w:tbl>
-    <w:p/>
-    <w:tbl>
-      <w:tblPr>
-        <w:tblStyle w:val="TableGrid"/>
-        <w:tblW w:type="auto" w:w="0"/>
-        <w:tblLook w:firstColumn="1" w:firstRow="1" w:lastColumn="0" w:lastRow="0" w:noHBand="0" w:noVBand="1" w:val="04A0"/>
-      </w:tblPr>
-      <w:tblGrid>
-        <w:gridCol w:w="9638"/>
-      </w:tblGrid>
-      <w:tr>
-        <w:tc>
-          <w:tcPr>
-            <w:tcW w:type="dxa" w:w="9638"/>
-            <w:shd w:val="clear" w:color="auto" w:fill="2D6A4F"/>
-          </w:tcPr>
-          <w:p>
-            <w:pPr>
-              <w:pStyle w:val="WS_H1"/>
-              <w:spacing w:before="40" w:after="40"/>
-            </w:pPr>
-            <w:r>
-              <w:rPr>
-                <w:b/>
-                <w:color w:val="FFFFFF"/>
-              </w:rPr>
-              <w:t>2. Elephant Population Status in Chhattisgarh</w:t>
+              <w:t>1. Elephant Population Status in Chhattisgarh</w:t>
             </w:r>
           </w:p>
         </w:tc>
@@ -1266,7 +533,7 @@
                 <w:b/>
                 <w:color w:val="FFFFFF"/>
               </w:rPr>
-              <w:t>3. Elephant Casualty Analysis (2021–2026)</w:t>
+              <w:t>2. Elephant Casualty Analysis (2021–2026)</w:t>
             </w:r>
           </w:p>
         </w:tc>
@@ -2004,7 +1271,7 @@
                 <w:b/>
                 <w:color w:val="FFFFFF"/>
               </w:rPr>
-              <w:t>4. Cause of Death Analysis</w:t>
+              <w:t>3. Cause of Death Analysis</w:t>
             </w:r>
           </w:p>
         </w:tc>
@@ -2470,7 +1737,7 @@
                 <w:b/>
                 <w:color w:val="FFFFFF"/>
               </w:rPr>
-              <w:t>5. Demographic Analysis of Casualties</w:t>
+              <w:t>4. Demographic Analysis of Casualties</w:t>
             </w:r>
           </w:p>
         </w:tc>
@@ -3152,7 +2419,7 @@
                 <w:b/>
                 <w:color w:val="FFFFFF"/>
               </w:rPr>
-              <w:t>6. Seasonal Variation in Mortality</w:t>
+              <w:t>5. Seasonal Variation in Mortality</w:t>
             </w:r>
           </w:p>
         </w:tc>
@@ -3636,7 +2903,7 @@
                 <w:b/>
                 <w:color w:val="FFFFFF"/>
               </w:rPr>
-              <w:t>7. Range-wise Distribution of Deaths</w:t>
+              <w:t>6. Range-wise Distribution of Deaths</w:t>
             </w:r>
           </w:p>
         </w:tc>
@@ -4610,7 +3877,7 @@
                 <w:b/>
                 <w:color w:val="FFFFFF"/>
               </w:rPr>
-              <w:t>8. Suspected Drowning — Post-Mortem Analysis</w:t>
+              <w:t>7. Suspected Drowning — Post-Mortem Analysis</w:t>
             </w:r>
           </w:p>
         </w:tc>
@@ -5275,7 +4542,7 @@
                 <w:b/>
                 <w:color w:val="FFFFFF"/>
               </w:rPr>
-              <w:t>9. Case Study — Gurda Calf Drowning (01 June 2026)</w:t>
+              <w:t>8. Case Study — Gurda Calf Drowning (01 June 2026)</w:t>
             </w:r>
           </w:p>
         </w:tc>
@@ -5653,299 +4920,7 @@
                 <w:b/>
                 <w:color w:val="FFFFFF"/>
               </w:rPr>
-              <w:t>10. Two-Day Workshop Programme</w:t>
-            </w:r>
-          </w:p>
-        </w:tc>
-      </w:tr>
-    </w:tbl>
-    <w:p/>
-    <w:tbl>
-      <w:tblPr>
-        <w:tblStyle w:val="TableGrid"/>
-        <w:tblW w:type="auto" w:w="0"/>
-        <w:tblLook w:firstColumn="1" w:firstRow="1" w:lastColumn="0" w:lastRow="0" w:noHBand="0" w:noVBand="1" w:val="04A0"/>
-      </w:tblPr>
-      <w:tblGrid>
-        <w:gridCol w:w="3213"/>
-        <w:gridCol w:w="3213"/>
-        <w:gridCol w:w="3213"/>
-      </w:tblGrid>
-      <w:tr>
-        <w:tc>
-          <w:tcPr>
-            <w:tcW w:type="dxa" w:w="2268"/>
-            <w:shd w:val="clear" w:color="auto" w:fill="2D6A4F"/>
-          </w:tcPr>
-          <w:p>
-            <w:pPr>
-              <w:pStyle w:val="WS_TH"/>
-              <w:spacing w:before="60" w:after="60"/>
-            </w:pPr>
-            <w:r>
-              <w:rPr>
-                <w:b/>
-                <w:color w:val="FFFFFF"/>
-              </w:rPr>
-              <w:t>Day / Session</w:t>
-            </w:r>
-          </w:p>
-        </w:tc>
-        <w:tc>
-          <w:tcPr>
-            <w:tcW w:type="dxa" w:w="5102"/>
-            <w:shd w:val="clear" w:color="auto" w:fill="2D6A4F"/>
-          </w:tcPr>
-          <w:p>
-            <w:pPr>
-              <w:pStyle w:val="WS_TH"/>
-              <w:spacing w:before="60" w:after="60"/>
-            </w:pPr>
-            <w:r>
-              <w:rPr>
-                <w:b/>
-                <w:color w:val="FFFFFF"/>
-              </w:rPr>
-              <w:t>Topics</w:t>
-            </w:r>
-          </w:p>
-        </w:tc>
-        <w:tc>
-          <w:tcPr>
-            <w:tcW w:type="dxa" w:w="2268"/>
-            <w:shd w:val="clear" w:color="auto" w:fill="2D6A4F"/>
-          </w:tcPr>
-          <w:p>
-            <w:pPr>
-              <w:pStyle w:val="WS_TH"/>
-              <w:spacing w:before="60" w:after="60"/>
-            </w:pPr>
-            <w:r>
-              <w:rPr>
-                <w:b/>
-                <w:color w:val="FFFFFF"/>
-              </w:rPr>
-              <w:t>Resource Person</w:t>
-            </w:r>
-          </w:p>
-        </w:tc>
-      </w:tr>
-      <w:tr>
-        <w:tc>
-          <w:tcPr>
-            <w:tcW w:type="dxa" w:w="2268"/>
-            <w:shd w:val="clear" w:color="auto" w:fill="FFFFFF"/>
-          </w:tcPr>
-          <w:p>
-            <w:pPr>
-              <w:pStyle w:val="WS_TD"/>
-              <w:spacing w:before="40" w:after="40"/>
-            </w:pPr>
-            <w:r>
-              <w:t>Day 1 — Morning</w:t>
-            </w:r>
-          </w:p>
-        </w:tc>
-        <w:tc>
-          <w:tcPr>
-            <w:tcW w:type="dxa" w:w="5102"/>
-            <w:shd w:val="clear" w:color="auto" w:fill="FFFFFF"/>
-          </w:tcPr>
-          <w:p>
-            <w:pPr>
-              <w:pStyle w:val="WS_TD"/>
-              <w:spacing w:before="40" w:after="40"/>
-            </w:pPr>
-            <w:r>
-              <w:t>Inauguration &amp; Overview | CG Population &amp; Mortality Statistics | Biological &amp; Anatomical Aspects</w:t>
-            </w:r>
-          </w:p>
-        </w:tc>
-        <w:tc>
-          <w:tcPr>
-            <w:tcW w:type="dxa" w:w="2268"/>
-            <w:shd w:val="clear" w:color="auto" w:fill="FFFFFF"/>
-          </w:tcPr>
-          <w:p>
-            <w:pPr>
-              <w:pStyle w:val="WS_TD"/>
-              <w:spacing w:before="40" w:after="40"/>
-            </w:pPr>
-            <w:r>
-              <w:t>Forest Officers, CG; Dr. Parag Nigam (WII)</w:t>
-            </w:r>
-          </w:p>
-        </w:tc>
-      </w:tr>
-      <w:tr>
-        <w:tc>
-          <w:tcPr>
-            <w:tcW w:type="dxa" w:w="2268"/>
-            <w:shd w:val="clear" w:color="auto" w:fill="EAF7EE"/>
-          </w:tcPr>
-          <w:p>
-            <w:pPr>
-              <w:pStyle w:val="WS_TD"/>
-              <w:spacing w:before="40" w:after="40"/>
-            </w:pPr>
-            <w:r>
-              <w:t>Day 1 — Afternoon</w:t>
-            </w:r>
-          </w:p>
-        </w:tc>
-        <w:tc>
-          <w:tcPr>
-            <w:tcW w:type="dxa" w:w="5102"/>
-            <w:shd w:val="clear" w:color="auto" w:fill="EAF7EE"/>
-          </w:tcPr>
-          <w:p>
-            <w:pPr>
-              <w:pStyle w:val="WS_TD"/>
-              <w:spacing w:before="40" w:after="40"/>
-            </w:pPr>
-            <w:r>
-              <w:t>Non-Infectious Diseases | Infectious Diseases &amp; Surveillance | Practical: PM Techniques</w:t>
-            </w:r>
-          </w:p>
-        </w:tc>
-        <w:tc>
-          <w:tcPr>
-            <w:tcW w:type="dxa" w:w="2268"/>
-            <w:shd w:val="clear" w:color="auto" w:fill="EAF7EE"/>
-          </w:tcPr>
-          <w:p>
-            <w:pPr>
-              <w:pStyle w:val="WS_TD"/>
-              <w:spacing w:before="40" w:after="40"/>
-            </w:pPr>
-            <w:r>
-              <w:t>Dr. Karikalan Mathesh (ICAR-IVRI); Dr. Tapendra Saini (WII)</w:t>
-            </w:r>
-          </w:p>
-        </w:tc>
-      </w:tr>
-      <w:tr>
-        <w:tc>
-          <w:tcPr>
-            <w:tcW w:type="dxa" w:w="2268"/>
-            <w:shd w:val="clear" w:color="auto" w:fill="FFFFFF"/>
-          </w:tcPr>
-          <w:p>
-            <w:pPr>
-              <w:pStyle w:val="WS_TD"/>
-              <w:spacing w:before="40" w:after="40"/>
-            </w:pPr>
-            <w:r>
-              <w:t>Day 2 — Morning</w:t>
-            </w:r>
-          </w:p>
-        </w:tc>
-        <w:tc>
-          <w:tcPr>
-            <w:tcW w:type="dxa" w:w="5102"/>
-            <w:shd w:val="clear" w:color="auto" w:fill="FFFFFF"/>
-          </w:tcPr>
-          <w:p>
-            <w:pPr>
-              <w:pStyle w:val="WS_TD"/>
-              <w:spacing w:before="40" w:after="40"/>
-            </w:pPr>
-            <w:r>
-              <w:t>Sample Collection &amp; Chain of Custody | Non-Infectious Pathology | Drowning &amp; Electrocution</w:t>
-            </w:r>
-          </w:p>
-        </w:tc>
-        <w:tc>
-          <w:tcPr>
-            <w:tcW w:type="dxa" w:w="2268"/>
-            <w:shd w:val="clear" w:color="auto" w:fill="FFFFFF"/>
-          </w:tcPr>
-          <w:p>
-            <w:pPr>
-              <w:pStyle w:val="WS_TD"/>
-              <w:spacing w:before="40" w:after="40"/>
-            </w:pPr>
-            <w:r>
-              <w:t>Dr. A. B. Shrivastav (NDVSU); Dr. C. P. Sharma (WII)</w:t>
-            </w:r>
-          </w:p>
-        </w:tc>
-      </w:tr>
-      <w:tr>
-        <w:tc>
-          <w:tcPr>
-            <w:tcW w:type="dxa" w:w="2268"/>
-            <w:shd w:val="clear" w:color="auto" w:fill="EAF7EE"/>
-          </w:tcPr>
-          <w:p>
-            <w:pPr>
-              <w:pStyle w:val="WS_TD"/>
-              <w:spacing w:before="40" w:after="40"/>
-            </w:pPr>
-            <w:r>
-              <w:t>Day 2 — Afternoon</w:t>
-            </w:r>
-          </w:p>
-        </w:tc>
-        <w:tc>
-          <w:tcPr>
-            <w:tcW w:type="dxa" w:w="5102"/>
-            <w:shd w:val="clear" w:color="auto" w:fill="EAF7EE"/>
-          </w:tcPr>
-          <w:p>
-            <w:pPr>
-              <w:pStyle w:val="WS_TD"/>
-              <w:spacing w:before="40" w:after="40"/>
-            </w:pPr>
-            <w:r>
-              <w:t>Case Studies | Carcass Disposal &amp; Site Remediation | Recommendations &amp; Valediction</w:t>
-            </w:r>
-          </w:p>
-        </w:tc>
-        <w:tc>
-          <w:tcPr>
-            <w:tcW w:type="dxa" w:w="2268"/>
-            <w:shd w:val="clear" w:color="auto" w:fill="EAF7EE"/>
-          </w:tcPr>
-          <w:p>
-            <w:pPr>
-              <w:pStyle w:val="WS_TD"/>
-              <w:spacing w:before="40" w:after="40"/>
-            </w:pPr>
-            <w:r>
-              <w:t>All resource persons; CG Forest Dept Officers</w:t>
-            </w:r>
-          </w:p>
-        </w:tc>
-      </w:tr>
-    </w:tbl>
-    <w:p/>
-    <w:tbl>
-      <w:tblPr>
-        <w:tblStyle w:val="TableGrid"/>
-        <w:tblW w:type="auto" w:w="0"/>
-        <w:tblLook w:firstColumn="1" w:firstRow="1" w:lastColumn="0" w:lastRow="0" w:noHBand="0" w:noVBand="1" w:val="04A0"/>
-      </w:tblPr>
-      <w:tblGrid>
-        <w:gridCol w:w="9638"/>
-      </w:tblGrid>
-      <w:tr>
-        <w:tc>
-          <w:tcPr>
-            <w:tcW w:type="dxa" w:w="9638"/>
-            <w:shd w:val="clear" w:color="auto" w:fill="2D6A4F"/>
-          </w:tcPr>
-          <w:p>
-            <w:pPr>
-              <w:pStyle w:val="WS_H1"/>
-              <w:spacing w:before="40" w:after="40"/>
-            </w:pPr>
-            <w:r>
-              <w:rPr>
-                <w:b/>
-                <w:color w:val="FFFFFF"/>
-              </w:rPr>
-              <w:t>11. Key Recommendations &amp; Priority Action Plan</w:t>
+              <w:t>9. Key Recommendations &amp; Priority Action Plan</w:t>
             </w:r>
           </w:p>
         </w:tc>

</xml_diff>